<commit_message>
FCT Configuration EntityFramwork DbContext DI
Création du ApplicationDbContext et ajout de DI du service SQL Server et de la connexion à la BD
</commit_message>
<xml_diff>
--- a/S04_Lab1_EF-main/S04_Lab1_EF_Template-main/S04_Lab_Instructions.docx
+++ b/S04_Lab1_EF-main/S04_Lab1_EF_Template-main/S04_Lab_Instructions.docx
@@ -410,14 +410,26 @@
           <w:numId w:val="5"/>
         </w:numPr>
         <w:spacing w:before="0" w:after="160" w:line="259" w:lineRule="auto"/>
-      </w:pPr>
-      <w:r>
+        <w:rPr>
+          <w:highlight w:val="yellow"/>
+        </w:rPr>
+      </w:pPr>
+      <w:r>
+        <w:rPr>
+          <w:highlight w:val="yellow"/>
+        </w:rPr>
         <w:t xml:space="preserve">Dans </w:t>
       </w:r>
       <w:r>
+        <w:rPr>
+          <w:highlight w:val="yellow"/>
+        </w:rPr>
         <w:t>Fork</w:t>
       </w:r>
       <w:r>
+        <w:rPr>
+          <w:highlight w:val="yellow"/>
+        </w:rPr>
         <w:t>, clonez le repository</w:t>
       </w:r>
     </w:p>
@@ -425,21 +437,36 @@
       <w:pPr>
         <w:pStyle w:val="Paragraphedeliste"/>
         <w:spacing w:before="0" w:after="160" w:line="259" w:lineRule="auto"/>
+        <w:rPr>
+          <w:highlight w:val="yellow"/>
+        </w:rPr>
       </w:pPr>
     </w:p>
     <w:p>
       <w:pPr>
         <w:pStyle w:val="Titre1"/>
-      </w:pPr>
-      <w:r>
+        <w:rPr>
+          <w:highlight w:val="yellow"/>
+        </w:rPr>
+      </w:pPr>
+      <w:r>
+        <w:rPr>
+          <w:highlight w:val="yellow"/>
+        </w:rPr>
         <w:t>Configuer le projet pour entity framework</w:t>
       </w:r>
     </w:p>
     <w:p>
       <w:pPr>
         <w:pStyle w:val="Titre2"/>
-      </w:pPr>
-      <w:r>
+        <w:rPr>
+          <w:highlight w:val="yellow"/>
+        </w:rPr>
+      </w:pPr>
+      <w:r>
+        <w:rPr>
+          <w:highlight w:val="yellow"/>
+        </w:rPr>
         <w:t>Installer les packages requis</w:t>
       </w:r>
     </w:p>
@@ -451,17 +478,32 @@
           <w:numId w:val="25"/>
         </w:numPr>
         <w:spacing w:before="0" w:after="160" w:line="259" w:lineRule="auto"/>
-      </w:pPr>
-      <w:r>
+        <w:rPr>
+          <w:highlight w:val="yellow"/>
+        </w:rPr>
+      </w:pPr>
+      <w:r>
+        <w:rPr>
+          <w:highlight w:val="yellow"/>
+        </w:rPr>
         <w:t xml:space="preserve">Ouvrez </w:t>
       </w:r>
       <w:r>
+        <w:rPr>
+          <w:highlight w:val="yellow"/>
+        </w:rPr>
         <w:t>l</w:t>
       </w:r>
       <w:r>
+        <w:rPr>
+          <w:highlight w:val="yellow"/>
+        </w:rPr>
         <w:t>e projet Visual Studio</w:t>
       </w:r>
       <w:r>
+        <w:rPr>
+          <w:highlight w:val="yellow"/>
+        </w:rPr>
         <w:t xml:space="preserve"> qui se trouve dans votre dossier cloné</w:t>
       </w:r>
     </w:p>
@@ -473,19 +515,34 @@
           <w:numId w:val="25"/>
         </w:numPr>
         <w:spacing w:before="0" w:after="160" w:line="259" w:lineRule="auto"/>
-      </w:pPr>
-      <w:r>
+        <w:rPr>
+          <w:highlight w:val="yellow"/>
+        </w:rPr>
+      </w:pPr>
+      <w:r>
+        <w:rPr>
+          <w:highlight w:val="yellow"/>
+        </w:rPr>
         <w:t xml:space="preserve">Allez dans Outils-Gestionnaire de packages </w:t>
       </w:r>
       <w:proofErr w:type="spellStart"/>
       <w:r>
+        <w:rPr>
+          <w:highlight w:val="yellow"/>
+        </w:rPr>
         <w:t>N</w:t>
       </w:r>
       <w:r>
+        <w:rPr>
+          <w:highlight w:val="yellow"/>
+        </w:rPr>
         <w:t>uGet</w:t>
       </w:r>
       <w:proofErr w:type="spellEnd"/>
       <w:r>
+        <w:rPr>
+          <w:highlight w:val="yellow"/>
+        </w:rPr>
         <w:t>-Gérer les packages de la solution</w:t>
       </w:r>
     </w:p>
@@ -497,25 +554,46 @@
           <w:numId w:val="25"/>
         </w:numPr>
         <w:spacing w:before="0" w:after="160" w:line="259" w:lineRule="auto"/>
-      </w:pPr>
-      <w:r>
+        <w:rPr>
+          <w:highlight w:val="yellow"/>
+        </w:rPr>
+      </w:pPr>
+      <w:r>
+        <w:rPr>
+          <w:highlight w:val="yellow"/>
+        </w:rPr>
         <w:t xml:space="preserve">Installer les </w:t>
       </w:r>
       <w:proofErr w:type="gramStart"/>
       <w:r>
+        <w:rPr>
+          <w:highlight w:val="yellow"/>
+        </w:rPr>
         <w:t>packages</w:t>
       </w:r>
       <w:proofErr w:type="gramEnd"/>
       <w:r>
+        <w:rPr>
+          <w:highlight w:val="yellow"/>
+        </w:rPr>
         <w:t xml:space="preserve"> suivants</w:t>
       </w:r>
       <w:r>
+        <w:rPr>
+          <w:highlight w:val="yellow"/>
+        </w:rPr>
         <w:t>, acceptez les licences et confirmez l'installation</w:t>
       </w:r>
       <w:r>
+        <w:rPr>
+          <w:highlight w:val="yellow"/>
+        </w:rPr>
         <w:t xml:space="preserve"> (messages)</w:t>
       </w:r>
       <w:r>
+        <w:rPr>
+          <w:highlight w:val="yellow"/>
+        </w:rPr>
         <w:t>:</w:t>
       </w:r>
     </w:p>
@@ -533,6 +611,7 @@
           <w:color w:val="000000"/>
           <w:sz w:val="19"/>
           <w:szCs w:val="19"/>
+          <w:highlight w:val="yellow"/>
         </w:rPr>
       </w:pPr>
       <w:proofErr w:type="spellStart"/>
@@ -542,6 +621,7 @@
           <w:color w:val="000000"/>
           <w:sz w:val="19"/>
           <w:szCs w:val="19"/>
+          <w:highlight w:val="yellow"/>
         </w:rPr>
         <w:t>Microsoft.EntityFrameworkCore</w:t>
       </w:r>
@@ -552,6 +632,7 @@
           <w:color w:val="000000"/>
           <w:sz w:val="19"/>
           <w:szCs w:val="19"/>
+          <w:highlight w:val="yellow"/>
         </w:rPr>
         <w:t xml:space="preserve"> </w:t>
       </w:r>
@@ -561,6 +642,7 @@
           <w:color w:val="000000"/>
           <w:sz w:val="19"/>
           <w:szCs w:val="19"/>
+          <w:highlight w:val="yellow"/>
         </w:rPr>
         <w:t>8</w:t>
       </w:r>
@@ -570,6 +652,7 @@
           <w:color w:val="000000"/>
           <w:sz w:val="19"/>
           <w:szCs w:val="19"/>
+          <w:highlight w:val="yellow"/>
         </w:rPr>
         <w:t>.0.</w:t>
       </w:r>
@@ -579,6 +662,7 @@
           <w:color w:val="000000"/>
           <w:sz w:val="19"/>
           <w:szCs w:val="19"/>
+          <w:highlight w:val="yellow"/>
         </w:rPr>
         <w:t>8</w:t>
       </w:r>
@@ -596,6 +680,7 @@
           <w:color w:val="000000"/>
           <w:sz w:val="19"/>
           <w:szCs w:val="19"/>
+          <w:highlight w:val="yellow"/>
         </w:rPr>
       </w:pPr>
       <w:proofErr w:type="spellStart"/>
@@ -606,6 +691,7 @@
           <w:color w:val="000000"/>
           <w:sz w:val="19"/>
           <w:szCs w:val="19"/>
+          <w:highlight w:val="yellow"/>
         </w:rPr>
         <w:t>Microsoft.EntityFrameworkCore.SqlServer</w:t>
       </w:r>
@@ -617,6 +703,7 @@
           <w:color w:val="000000"/>
           <w:sz w:val="19"/>
           <w:szCs w:val="19"/>
+          <w:highlight w:val="yellow"/>
         </w:rPr>
         <w:t xml:space="preserve"> </w:t>
       </w:r>
@@ -626,6 +713,7 @@
           <w:color w:val="000000"/>
           <w:sz w:val="19"/>
           <w:szCs w:val="19"/>
+          <w:highlight w:val="yellow"/>
         </w:rPr>
         <w:t>8</w:t>
       </w:r>
@@ -635,6 +723,7 @@
           <w:color w:val="000000"/>
           <w:sz w:val="19"/>
           <w:szCs w:val="19"/>
+          <w:highlight w:val="yellow"/>
         </w:rPr>
         <w:t>.0.</w:t>
       </w:r>
@@ -644,6 +733,7 @@
           <w:color w:val="000000"/>
           <w:sz w:val="19"/>
           <w:szCs w:val="19"/>
+          <w:highlight w:val="yellow"/>
         </w:rPr>
         <w:t>8</w:t>
       </w:r>
@@ -656,10 +746,16 @@
         </w:numPr>
         <w:spacing w:before="0" w:after="100" w:afterAutospacing="1" w:line="240" w:lineRule="auto"/>
         <w:ind w:left="1423" w:hanging="357"/>
+        <w:rPr>
+          <w:highlight w:val="yellow"/>
+        </w:rPr>
       </w:pPr>
       <w:proofErr w:type="spellStart"/>
       <w:proofErr w:type="gramStart"/>
       <w:r>
+        <w:rPr>
+          <w:highlight w:val="yellow"/>
+        </w:rPr>
         <w:t>Microsoft.EntityFrameworkCore.tools</w:t>
       </w:r>
       <w:proofErr w:type="spellEnd"/>
@@ -670,6 +766,7 @@
           <w:color w:val="000000"/>
           <w:sz w:val="19"/>
           <w:szCs w:val="19"/>
+          <w:highlight w:val="yellow"/>
         </w:rPr>
         <w:t xml:space="preserve"> </w:t>
       </w:r>
@@ -679,6 +776,7 @@
           <w:color w:val="000000"/>
           <w:sz w:val="19"/>
           <w:szCs w:val="19"/>
+          <w:highlight w:val="yellow"/>
         </w:rPr>
         <w:t>8</w:t>
       </w:r>
@@ -688,6 +786,7 @@
           <w:color w:val="000000"/>
           <w:sz w:val="19"/>
           <w:szCs w:val="19"/>
+          <w:highlight w:val="yellow"/>
         </w:rPr>
         <w:t>.0.</w:t>
       </w:r>
@@ -697,6 +796,7 @@
           <w:color w:val="000000"/>
           <w:sz w:val="19"/>
           <w:szCs w:val="19"/>
+          <w:highlight w:val="yellow"/>
         </w:rPr>
         <w:t>8</w:t>
       </w:r>
@@ -710,11 +810,13 @@
         <w:spacing w:before="0" w:after="100" w:afterAutospacing="1" w:line="240" w:lineRule="auto"/>
         <w:ind w:left="1423" w:hanging="357"/>
         <w:rPr>
-          <w:lang w:val="en-CA"/>
-        </w:rPr>
-      </w:pPr>
-      <w:r>
-        <w:rPr>
+          <w:highlight w:val="yellow"/>
+          <w:lang w:val="en-CA"/>
+        </w:rPr>
+      </w:pPr>
+      <w:r>
+        <w:rPr>
+          <w:highlight w:val="yellow"/>
           <w:lang w:val="en-CA"/>
         </w:rPr>
         <w:t>Microsoft.VisualStudio.Web.CodeGeneration.Design</w:t>
@@ -725,6 +827,7 @@
           <w:color w:val="000000"/>
           <w:sz w:val="19"/>
           <w:szCs w:val="19"/>
+          <w:highlight w:val="yellow"/>
           <w:lang w:val="en-CA"/>
         </w:rPr>
         <w:t xml:space="preserve"> </w:t>
@@ -737,6 +840,7 @@
           <w:color w:val="000000"/>
           <w:sz w:val="19"/>
           <w:szCs w:val="19"/>
+          <w:highlight w:val="yellow"/>
           <w:lang w:val="en-CA"/>
         </w:rPr>
         <w:t>8</w:t>
@@ -749,6 +853,7 @@
           <w:color w:val="000000"/>
           <w:sz w:val="19"/>
           <w:szCs w:val="19"/>
+          <w:highlight w:val="yellow"/>
           <w:lang w:val="en-CA"/>
         </w:rPr>
         <w:t>.0.</w:t>
@@ -761,6 +866,7 @@
           <w:color w:val="000000"/>
           <w:sz w:val="19"/>
           <w:szCs w:val="19"/>
+          <w:highlight w:val="yellow"/>
           <w:lang w:val="en-CA"/>
         </w:rPr>
         <w:t>4</w:t>
@@ -6399,29 +6505,7 @@
           <w:szCs w:val="16"/>
           <w:lang w:val="en-CA"/>
         </w:rPr>
-        <w:t xml:space="preserve">    </w:t>
-      </w:r>
-      <w:proofErr w:type="spellStart"/>
-      <w:r>
-        <w:rPr>
-          <w:rFonts w:ascii="Cascadia Mono" w:hAnsi="Cascadia Mono" w:cs="Cascadia Mono"/>
-          <w:color w:val="000000"/>
-          <w:sz w:val="16"/>
-          <w:szCs w:val="16"/>
-          <w:lang w:val="en-CA"/>
-        </w:rPr>
-        <w:t>ZombieTypes</w:t>
-      </w:r>
-      <w:proofErr w:type="spellEnd"/>
-      <w:r>
-        <w:rPr>
-          <w:rFonts w:ascii="Cascadia Mono" w:hAnsi="Cascadia Mono" w:cs="Cascadia Mono"/>
-          <w:color w:val="000000"/>
-          <w:sz w:val="16"/>
-          <w:szCs w:val="16"/>
-          <w:lang w:val="en-CA"/>
-        </w:rPr>
-        <w:t xml:space="preserve"> = </w:t>
+        <w:t xml:space="preserve">    ZombieTypes = </w:t>
       </w:r>
       <w:r>
         <w:rPr>
@@ -11793,29 +11877,7 @@
           <w:szCs w:val="19"/>
           <w:lang w:val="en-CA"/>
         </w:rPr>
-        <w:t xml:space="preserve"> </w:t>
-      </w:r>
-      <w:proofErr w:type="spellStart"/>
-      <w:r>
-        <w:rPr>
-          <w:rFonts w:ascii="Cascadia Mono" w:hAnsi="Cascadia Mono" w:cs="Cascadia Mono"/>
-          <w:color w:val="000000"/>
-          <w:sz w:val="19"/>
-          <w:szCs w:val="19"/>
-          <w:lang w:val="en-CA"/>
-        </w:rPr>
-        <w:t>IActionResult</w:t>
-      </w:r>
-      <w:proofErr w:type="spellEnd"/>
-      <w:r>
-        <w:rPr>
-          <w:rFonts w:ascii="Cascadia Mono" w:hAnsi="Cascadia Mono" w:cs="Cascadia Mono"/>
-          <w:color w:val="000000"/>
-          <w:sz w:val="19"/>
-          <w:szCs w:val="19"/>
-          <w:lang w:val="en-CA"/>
-        </w:rPr>
-        <w:t xml:space="preserve"> Index()</w:t>
+        <w:t xml:space="preserve"> IActionResult Index()</w:t>
       </w:r>
     </w:p>
     <w:p>
@@ -12899,29 +12961,7 @@
           <w:szCs w:val="19"/>
           <w:lang w:val="en-US"/>
         </w:rPr>
-        <w:t xml:space="preserve"> </w:t>
-      </w:r>
-      <w:proofErr w:type="spellStart"/>
-      <w:r>
-        <w:rPr>
-          <w:rFonts w:ascii="Cascadia Mono" w:hAnsi="Cascadia Mono" w:cs="Cascadia Mono"/>
-          <w:color w:val="000000"/>
-          <w:sz w:val="19"/>
-          <w:szCs w:val="19"/>
-          <w:lang w:val="en-US"/>
-        </w:rPr>
-        <w:t>IActionResult</w:t>
-      </w:r>
-      <w:proofErr w:type="spellEnd"/>
-      <w:r>
-        <w:rPr>
-          <w:rFonts w:ascii="Cascadia Mono" w:hAnsi="Cascadia Mono" w:cs="Cascadia Mono"/>
-          <w:color w:val="000000"/>
-          <w:sz w:val="19"/>
-          <w:szCs w:val="19"/>
-          <w:lang w:val="en-US"/>
-        </w:rPr>
-        <w:t xml:space="preserve"> </w:t>
+        <w:t xml:space="preserve"> IActionResult </w:t>
       </w:r>
       <w:proofErr w:type="gramStart"/>
       <w:r>
@@ -20200,8 +20240,13 @@
       <w:tab/>
     </w:r>
     <w:r>
-      <w:t xml:space="preserve"> et Mathieu Briau</w:t>
+      <w:t xml:space="preserve"> et Mathieu </w:t>
     </w:r>
+    <w:proofErr w:type="spellStart"/>
+    <w:r>
+      <w:t>Briau</w:t>
+    </w:r>
+    <w:proofErr w:type="spellEnd"/>
     <w:r>
       <w:tab/>
     </w:r>
@@ -26159,15 +26204,6 @@
 </file>
 
 <file path=customXml/item1.xml><?xml version="1.0" encoding="utf-8"?>
-<?mso-contentType ?>
-<FormTemplates xmlns="http://schemas.microsoft.com/sharepoint/v3/contenttype/forms">
-  <Display>DocumentLibraryForm</Display>
-  <Edit>DocumentLibraryForm</Edit>
-  <New>DocumentLibraryForm</New>
-</FormTemplates>
-</file>
-
-<file path=customXml/item2.xml><?xml version="1.0" encoding="utf-8"?>
 <ct:contentTypeSchema xmlns:ct="http://schemas.microsoft.com/office/2006/metadata/contentType" xmlns:ma="http://schemas.microsoft.com/office/2006/metadata/properties/metaAttributes" ct:_="" ma:_="" ma:contentTypeName="Document" ma:contentTypeID="0x010100354AEAE9FD62D747A26A546E5B1B5735" ma:contentTypeVersion="7" ma:contentTypeDescription="Crée un document." ma:contentTypeScope="" ma:versionID="43b763fe9aa20b7a2976a5e019d82dbf">
   <xsd:schema xmlns:xsd="http://www.w3.org/2001/XMLSchema" xmlns:xs="http://www.w3.org/2001/XMLSchema" xmlns:p="http://schemas.microsoft.com/office/2006/metadata/properties" xmlns:ns2="071933db-0376-4694-9786-b56cb37c4ec2" targetNamespace="http://schemas.microsoft.com/office/2006/metadata/properties" ma:root="true" ma:fieldsID="d5c90ae6c1ec6ed317c9f5feddaf7a33" ns2:_="">
     <xsd:import namespace="071933db-0376-4694-9786-b56cb37c4ec2"/>
@@ -26331,6 +26367,15 @@
 </ct:contentTypeSchema>
 </file>
 
+<file path=customXml/item2.xml><?xml version="1.0" encoding="utf-8"?>
+<?mso-contentType ?>
+<FormTemplates xmlns="http://schemas.microsoft.com/sharepoint/v3/contenttype/forms">
+  <Display>DocumentLibraryForm</Display>
+  <Edit>DocumentLibraryForm</Edit>
+  <New>DocumentLibraryForm</New>
+</FormTemplates>
+</file>
+
 <file path=customXml/item3.xml><?xml version="1.0" encoding="utf-8"?>
 <p:properties xmlns:p="http://schemas.microsoft.com/office/2006/metadata/properties" xmlns:xsi="http://www.w3.org/2001/XMLSchema-instance" xmlns:pc="http://schemas.microsoft.com/office/infopath/2007/PartnerControls">
   <documentManagement/>
@@ -26338,14 +26383,6 @@
 </file>
 
 <file path=customXml/itemProps1.xml><?xml version="1.0" encoding="utf-8"?>
-<ds:datastoreItem xmlns:ds="http://schemas.openxmlformats.org/officeDocument/2006/customXml" ds:itemID="{F6194C16-5FE5-4670-BEC8-3D6DD9380312}">
-  <ds:schemaRefs>
-    <ds:schemaRef ds:uri="http://schemas.microsoft.com/sharepoint/v3/contenttype/forms"/>
-  </ds:schemaRefs>
-</ds:datastoreItem>
-</file>
-
-<file path=customXml/itemProps2.xml><?xml version="1.0" encoding="utf-8"?>
 <ds:datastoreItem xmlns:ds="http://schemas.openxmlformats.org/officeDocument/2006/customXml" ds:itemID="{5C3A06EC-DC03-4D65-AA15-C6B9D68C1ED0}">
   <ds:schemaRefs>
     <ds:schemaRef ds:uri="http://schemas.microsoft.com/office/2006/metadata/contentType"/>
@@ -26363,6 +26400,14 @@
 </ds:datastoreItem>
 </file>
 
+<file path=customXml/itemProps2.xml><?xml version="1.0" encoding="utf-8"?>
+<ds:datastoreItem xmlns:ds="http://schemas.openxmlformats.org/officeDocument/2006/customXml" ds:itemID="{F6194C16-5FE5-4670-BEC8-3D6DD9380312}">
+  <ds:schemaRefs>
+    <ds:schemaRef ds:uri="http://schemas.microsoft.com/sharepoint/v3/contenttype/forms"/>
+  </ds:schemaRefs>
+</ds:datastoreItem>
+</file>
+
 <file path=customXml/itemProps3.xml><?xml version="1.0" encoding="utf-8"?>
 <ds:datastoreItem xmlns:ds="http://schemas.openxmlformats.org/officeDocument/2006/customXml" ds:itemID="{2C36E056-BA2C-4A1F-9580-242C9B36FE70}">
   <ds:schemaRefs>

</xml_diff>